<commit_message>
Salva ajustes manuais nos modelos integral/participativo e adiciona .gitignore
Ignora prontos/ (saida gerada com dados de beneficiario), locks ~$ do Word
e __pycache__.
</commit_message>
<xml_diff>
--- a/modelos/2026/integral.docx
+++ b/modelos/2026/integral.docx
@@ -3,151 +3,12 @@
 <w:document xmlns:wpc="http://schemas.microsoft.com/office/word/2010/wordprocessingCanvas" xmlns:cx="http://schemas.microsoft.com/office/drawing/2014/chartex" xmlns:cx1="http://schemas.microsoft.com/office/drawing/2015/9/8/chartex" xmlns:cx2="http://schemas.microsoft.com/office/drawing/2015/10/21/chartex" xmlns:cx3="http://schemas.microsoft.com/office/drawing/2016/5/9/chartex" xmlns:cx4="http://schemas.microsoft.com/office/drawing/2016/5/10/chartex" xmlns:cx5="http://schemas.microsoft.com/office/drawing/2016/5/11/chartex" xmlns:cx6="http://schemas.microsoft.com/office/drawing/2016/5/12/chartex" xmlns:cx7="http://schemas.microsoft.com/office/drawing/2016/5/13/chartex" xmlns:cx8="http://schemas.microsoft.com/office/drawing/2016/5/14/chartex" xmlns:mc="http://schemas.openxmlformats.org/markup-compatibility/2006" xmlns:aink="http://schemas.microsoft.com/office/drawing/2016/ink" xmlns:am3d="http://schemas.microsoft.com/office/drawing/2017/model3d" xmlns:o="urn:schemas-microsoft-com:office:office" xmlns:oel="http://schemas.microsoft.com/office/2019/extlst" xmlns:r="http://schemas.openxmlformats.org/officeDocument/2006/relationships" xmlns:m="http://schemas.openxmlformats.org/officeDocument/2006/math" xmlns:v="urn:schemas-microsoft-com:vml" xmlns:wp14="http://schemas.microsoft.com/office/word/2010/wordprocessingDrawing" xmlns:wp="http://schemas.openxmlformats.org/drawingml/2006/wordprocessingDrawing" xmlns:w10="urn:schemas-microsoft-com:office:word" xmlns:w="http://schemas.openxmlformats.org/wordprocessingml/2006/main" xmlns:w14="http://schemas.microsoft.com/office/word/2010/wordml" xmlns:w15="http://schemas.microsoft.com/office/word/2012/wordml" xmlns:w16cei="http://schemas.microsoft.com/office/word/2026/wordml/cei" xmlns:w16cex="http://schemas.microsoft.com/office/word/2018/wordml/cex" xmlns:w16cid="http://schemas.microsoft.com/office/word/2016/wordml/cid" xmlns:w16="http://schemas.microsoft.com/office/word/2018/wordml" xmlns:w16du="http://schemas.microsoft.com/office/word/2023/wordml/word16du" xmlns:w16sdtdh="http://schemas.microsoft.com/office/word/2020/wordml/sdtdatahash" xmlns:w16sdtfl="http://schemas.microsoft.com/office/word/2024/wordml/sdtformatlock" xmlns:w16se="http://schemas.microsoft.com/office/word/2015/wordml/symex" xmlns:wpg="http://schemas.microsoft.com/office/word/2010/wordprocessingGroup" xmlns:wpi="http://schemas.microsoft.com/office/word/2010/wordprocessingInk" xmlns:wne="http://schemas.microsoft.com/office/word/2006/wordml" xmlns:wps="http://schemas.microsoft.com/office/word/2010/wordprocessingShape" mc:Ignorable="w14 w15 w16se w16cid w16 w16cex w16sdtdh w16sdtfl w16du wp14">
   <w:body>
     <w:p>
-      <w:pPr>
-        <w:spacing w:after="0" w:line="0" w:lineRule="auto"/>
-        <w:rPr>
-          <w:rFonts w:ascii="Arial" w:eastAsia="Times New Roman" w:hAnsi="Arial" w:cs="Arial"/>
-          <w:color w:val="000000"/>
-          <w:kern w:val="0"/>
-          <w:sz w:val="2"/>
-          <w:szCs w:val="2"/>
-          <w:lang w:eastAsia="pt-BR"/>
-          <w14:ligatures w14:val="none"/>
-        </w:rPr>
-      </w:pPr>
       <w:r>
-        <w:rPr>
-          <w:rFonts w:ascii="Arial" w:eastAsia="Times New Roman" w:hAnsi="Arial" w:cs="Arial"/>
-          <w:noProof/>
-          <w:color w:val="000000"/>
-          <w:kern w:val="0"/>
-          <w:sz w:val="2"/>
-          <w:szCs w:val="2"/>
-          <w:lang w:eastAsia="pt-BR"/>
-          <w14:ligatures w14:val="none"/>
-        </w:rPr>
         <w:drawing>
-          <wp:inline distT="0" distB="0" distL="0" distR="0" wp14:anchorId="23BBE18A" wp14:editId="43805610">
+          <wp:inline distT="0" distB="0" distL="0" distR="0" wp14:anchorId="470D357B" wp14:editId="36C49EA1">
             <wp:extent cx="9525" cy="9525"/>
             <wp:effectExtent l="0" t="0" r="0" b="0"/>
-            <wp:docPr id="979319053" name="Imagem 4"/>
-            <wp:cNvGraphicFramePr>
-              <a:graphicFrameLocks xmlns:a="http://schemas.openxmlformats.org/drawingml/2006/main" noChangeAspect="1"/>
-            </wp:cNvGraphicFramePr>
-            <a:graphic xmlns:a="http://schemas.openxmlformats.org/drawingml/2006/main">
-              <a:graphicData uri="http://schemas.openxmlformats.org/drawingml/2006/picture">
-                <pic:pic xmlns:pic="http://schemas.openxmlformats.org/drawingml/2006/picture">
-                  <pic:nvPicPr>
-                    <pic:cNvPr id="0" name="Picture 1"/>
-                    <pic:cNvPicPr>
-                      <a:picLocks noChangeAspect="1" noChangeArrowheads="1"/>
-                    </pic:cNvPicPr>
-                  </pic:nvPicPr>
-                  <pic:blipFill>
-                    <a:blip r:embed="rId7">
-                      <a:extLst>
-                        <a:ext uri="{28A0092B-C50C-407E-A947-70E740481C1C}">
-                          <a14:useLocalDpi xmlns:a14="http://schemas.microsoft.com/office/drawing/2010/main" val="0"/>
-                        </a:ext>
-                      </a:extLst>
-                    </a:blip>
-                    <a:srcRect/>
-                    <a:stretch>
-                      <a:fillRect/>
-                    </a:stretch>
-                  </pic:blipFill>
-                  <pic:spPr bwMode="auto">
-                    <a:xfrm>
-                      <a:off x="0" y="0"/>
-                      <a:ext cx="9525" cy="9525"/>
-                    </a:xfrm>
-                    <a:prstGeom prst="rect">
-                      <a:avLst/>
-                    </a:prstGeom>
-                    <a:noFill/>
-                    <a:ln>
-                      <a:noFill/>
-                    </a:ln>
-                  </pic:spPr>
-                </pic:pic>
-              </a:graphicData>
-            </a:graphic>
-          </wp:inline>
-        </w:drawing>
-      </w:r>
-    </w:p>
-    <w:tbl>
-      <w:tblPr>
-        <w:tblW w:w="5000" w:type="pct"/>
-        <w:jc w:val="center"/>
-        <w:tblCellMar>
-          <w:left w:w="0" w:type="dxa"/>
-          <w:right w:w="0" w:type="dxa"/>
-        </w:tblCellMar>
-        <w:tblLook w:val="04A0" w:firstRow="1" w:lastRow="0" w:firstColumn="1" w:lastColumn="0" w:noHBand="0" w:noVBand="1"/>
-      </w:tblPr>
-      <w:tblGrid>
-        <w:gridCol w:w="8504"/>
-      </w:tblGrid>
-      <w:tr>
-        <w:trPr>
-          <w:jc w:val="center"/>
-        </w:trPr>
-        <w:tc>
-          <w:tcPr>
-            <w:tcW w:w="0" w:type="auto"/>
-            <w:vAlign w:val="center"/>
-          </w:tcPr>
-          <w:p>
-            <w:pPr>
-              <w:spacing w:after="0" w:line="240" w:lineRule="auto"/>
-              <w:jc w:val="center"/>
-              <w:rPr>
-                <w:rFonts w:ascii="Arial" w:eastAsia="Times New Roman" w:hAnsi="Arial" w:cs="Arial"/>
-                <w:color w:val="000000"/>
-                <w:kern w:val="0"/>
-                <w:sz w:val="24"/>
-                <w:szCs w:val="24"/>
-                <w:lang w:eastAsia="pt-BR"/>
-                <w14:ligatures w14:val="none"/>
-              </w:rPr>
-            </w:pPr>
-          </w:p>
-        </w:tc>
-      </w:tr>
-      <w:tr>
-        <w:trPr>
-          <w:jc w:val="center"/>
-        </w:trPr>
-        <w:tc>
-          <w:tcPr>
-            <w:tcW w:w="0" w:type="auto"/>
-            <w:hideMark/>
-          </w:tcPr>
-          <w:p>
-            <w:pPr>
-              <w:spacing w:after="0" w:line="240" w:lineRule="auto"/>
-              <w:jc w:val="center"/>
-              <w:rPr>
-                <w:rFonts w:ascii="Times New Roman" w:eastAsia="Times New Roman" w:hAnsi="Times New Roman" w:cs="Times New Roman"/>
-                <w:kern w:val="0"/>
-                <w:sz w:val="20"/>
-                <w:szCs w:val="20"/>
-                <w:lang w:eastAsia="pt-BR"/>
-                <w14:ligatures w14:val="none"/>
-              </w:rPr>
-            </w:pPr>
-          </w:p>
-        </w:tc>
-      </w:tr>
-    </w:tbl>
-    <w:p>
-      <w:r>
-        <w:drawing>
-          <wp:inline distT="0" distB="0" distL="0" distR="0" wp14:anchorId="7023D670" wp14:editId="2E3BD9E5">
-            <wp:extent cx="9525" cy="9525"/>
-            <wp:effectExtent l="0" t="0" r="0" b="0"/>
-            <wp:docPr id="186415490" name="Imagem 6"/>
+            <wp:docPr id="1561239674" name="Imagem 6"/>
             <wp:cNvGraphicFramePr>
               <a:graphicFrameLocks xmlns:a="http://schemas.openxmlformats.org/drawingml/2006/main" noChangeAspect="1"/>
             </wp:cNvGraphicFramePr>
@@ -206,18 +67,6 @@
       <w:tblGrid>
         <w:gridCol w:w="8504"/>
       </w:tblGrid>
-      <w:tr>
-        <w:trPr>
-          <w:jc w:val="center"/>
-        </w:trPr>
-        <w:tc>
-          <w:tcPr>
-            <w:tcW w:w="0" w:type="auto"/>
-            <w:hideMark/>
-          </w:tcPr>
-          <w:p/>
-        </w:tc>
-      </w:tr>
       <w:tr>
         <w:trPr>
           <w:jc w:val="center"/>
@@ -488,10 +337,10 @@
                                                                                   <w:p>
                                                                                     <w:r>
                                                                                       <w:drawing>
-                                                                                        <wp:inline distT="0" distB="0" distL="0" distR="0" wp14:anchorId="29E67A4E" wp14:editId="67D3E0A1">
-                                                                                          <wp:extent cx="2457450" cy="704850"/>
-                                                                                          <wp:effectExtent l="0" t="0" r="0" b="0"/>
-                                                                                          <wp:docPr id="1465502683" name="Imagem 5"/>
+                                                                                        <wp:inline distT="0" distB="0" distL="0" distR="0" wp14:anchorId="60C99BF4" wp14:editId="6616D432">
+                                                                                          <wp:extent cx="2457450" cy="847725"/>
+                                                                                          <wp:effectExtent l="0" t="0" r="0" b="9525"/>
+                                                                                          <wp:docPr id="2536945" name="Imagem 5"/>
                                                                                           <wp:cNvGraphicFramePr>
                                                                                             <a:graphicFrameLocks xmlns:a="http://schemas.openxmlformats.org/drawingml/2006/main" noChangeAspect="1"/>
                                                                                           </wp:cNvGraphicFramePr>
@@ -520,7 +369,7 @@
                                                                                                 <pic:spPr bwMode="auto">
                                                                                                   <a:xfrm>
                                                                                                     <a:off x="0" y="0"/>
-                                                                                                    <a:ext cx="2457450" cy="704850"/>
+                                                                                                    <a:ext cx="2457450" cy="847725"/>
                                                                                                   </a:xfrm>
                                                                                                   <a:prstGeom prst="rect">
                                                                                                     <a:avLst/>
@@ -577,34 +426,19 @@
                                                                               <w:hideMark/>
                                                                             </w:tcPr>
                                                                             <w:p>
-                                                                              <w:pPr>
-                                                                                <w:rPr>
-                                                                                  <w:color w:val="FFFFFF" w:themeColor="background1"/>
-                                                                                </w:rPr>
-                                                                              </w:pPr>
                                                                               <w:r>
-                                                                                <w:rPr>
-                                                                                  <w:color w:val="FFFFFF" w:themeColor="background1"/>
-                                                                                </w:rPr>
                                                                                 <w:br/>
                                                                               </w:r>
                                                                               <w:r>
-                                                                                <w:rPr>
-                                                                                  <w:color w:val="FFFFFF" w:themeColor="background1"/>
-                                                                                </w:rPr>
                                                                                 <w:br/>
                                                                               </w:r>
                                                                               <w:r>
-                                                                                <w:rPr>
-                                                                                  <w:color w:val="FFFFFF" w:themeColor="background1"/>
-                                                                                </w:rPr>
                                                                                 <w:br/>
                                                                               </w:r>
                                                                               <w:r>
                                                                                 <w:rPr>
                                                                                   <w:b/>
                                                                                   <w:bCs/>
-                                                                                  <w:color w:val="FFFFFF" w:themeColor="background1"/>
                                                                                 </w:rPr>
                                                                                 <w:t>Aviso de Reajuste</w:t>
                                                                               </w:r>
@@ -612,7 +446,6 @@
                                                                                 <w:rPr>
                                                                                   <w:b/>
                                                                                   <w:bCs/>
-                                                                                  <w:color w:val="FFFFFF" w:themeColor="background1"/>
                                                                                 </w:rPr>
                                                                                 <w:br/>
                                                                                 <w:t>Informe CASSI - Agosto/2026</w:t>
@@ -707,8 +540,8 @@
                                                               <w:tblLook w:val="04A0" w:firstRow="1" w:lastRow="0" w:firstColumn="1" w:lastColumn="0" w:noHBand="0" w:noVBand="1"/>
                                                             </w:tblPr>
                                                             <w:tblGrid>
-                                                              <w:gridCol w:w="5568"/>
-                                                              <w:gridCol w:w="2320"/>
+                                                              <w:gridCol w:w="5560"/>
+                                                              <w:gridCol w:w="2328"/>
                                                             </w:tblGrid>
                                                             <w:tr>
                                                               <w:trPr>
@@ -779,31 +612,32 @@
                                                                 </w:tcPr>
                                                                 <w:p>
                                                                   <w:pPr>
+                                                                    <w:pStyle w:val="NormalWeb"/>
+                                                                    <w:spacing w:after="0"/>
+                                                                  </w:pPr>
+                                                                  <w:proofErr w:type="gramStart"/>
+                                                                  <w:r>
                                                                     <w:rPr>
+                                                                      <w:rStyle w:val="docx-char-spacing"/>
+                                                                      <w:rFonts w:ascii="Verdana" w:hAnsi="Verdana"/>
                                                                       <w:b/>
                                                                       <w:bCs/>
+                                                                      <w:sz w:val="17"/>
+                                                                      <w:szCs w:val="17"/>
                                                                     </w:rPr>
-                                                                  </w:pPr>
+                                                                    <w:t>{{ NOMEBENEFICIARIO</w:t>
+                                                                  </w:r>
+                                                                  <w:proofErr w:type="gramEnd"/>
                                                                   <w:r>
                                                                     <w:rPr>
+                                                                      <w:rStyle w:val="docx-char-spacing"/>
+                                                                      <w:rFonts w:ascii="Verdana" w:hAnsi="Verdana"/>
                                                                       <w:b/>
                                                                       <w:bCs/>
+                                                                      <w:sz w:val="17"/>
+                                                                      <w:szCs w:val="17"/>
                                                                     </w:rPr>
-                                                                    <w:t>{{</w:t>
-                                                                  </w:r>
-                                                                  <w:r>
-                                                                    <w:rPr>
-                                                                      <w:b/>
-                                                                      <w:bCs/>
-                                                                    </w:rPr>
-                                                                    <w:t>NOMEBENEFICIARIO</w:t>
-                                                                  </w:r>
-                                                                  <w:r>
-                                                                    <w:rPr>
-                                                                      <w:b/>
-                                                                      <w:bCs/>
-                                                                    </w:rPr>
-                                                                    <w:t>}}</w:t>
+                                                                    <w:t xml:space="preserve"> }}</w:t>
                                                                   </w:r>
                                                                 </w:p>
                                                               </w:tc>
@@ -820,12 +654,21 @@
                                                                   <w:hideMark/>
                                                                 </w:tcPr>
                                                                 <w:p>
+                                                                  <w:proofErr w:type="gramStart"/>
                                                                   <w:r>
                                                                     <w:rPr>
                                                                       <w:b/>
                                                                       <w:bCs/>
                                                                     </w:rPr>
-                                                                    <w:t>{{ NUMEROPLANO }}</w:t>
+                                                                    <w:t>{{ NUMEROPLANO</w:t>
+                                                                  </w:r>
+                                                                  <w:proofErr w:type="gramEnd"/>
+                                                                  <w:r>
+                                                                    <w:rPr>
+                                                                      <w:b/>
+                                                                      <w:bCs/>
+                                                                    </w:rPr>
+                                                                    <w:t xml:space="preserve"> }}</w:t>
                                                                   </w:r>
                                                                 </w:p>
                                                               </w:tc>
@@ -899,17 +742,29 @@
                                                             </w:r>
                                                             <w:r>
                                                               <w:br/>
-                                                              <w:t>Nos termos da Cláusula 30, “I”, do Contrato de Adesão ao Plano CASSI Família Participativo, o valor da mensalidade sofrerá reajuste anual, no percentual de </w:t>
+                                                              <w:t>Nos termos da Cláusula 28, “I”, do Contrato de Adesão ao Plano CASSI Família Integral, o valor da mensalidade sofrerá reajuste anual, no percentual de</w:t>
                                                             </w:r>
                                                             <w:r>
                                                               <w:rPr>
                                                                 <w:b/>
                                                                 <w:bCs/>
                                                               </w:rPr>
-                                                              <w:t>4,60% </w:t>
-                                                            </w:r>
-                                                            <w:r>
-                                                              <w:t>(quatro vírgula sessenta por cento), em </w:t>
+                                                              <w:t> 4,60</w:t>
+                                                            </w:r>
+                                                            <w:proofErr w:type="gramStart"/>
+                                                            <w:r>
+                                                              <w:rPr>
+                                                                <w:b/>
+                                                                <w:bCs/>
+                                                              </w:rPr>
+                                                              <w:t>%</w:t>
+                                                            </w:r>
+                                                            <w:r>
+                                                              <w:t> ,</w:t>
+                                                            </w:r>
+                                                            <w:proofErr w:type="gramEnd"/>
+                                                            <w:r>
+                                                              <w:t xml:space="preserve"> em </w:t>
                                                             </w:r>
                                                             <w:r>
                                                               <w:rPr>
@@ -926,7 +781,7 @@
                                                             </w:r>
                                                             <w:r>
                                                               <w:br/>
-                                                              <w:t>O Plano CASSI Família Participativo, plano coletivo sem patrocinador, está registrado na ANS sob o n° 505.026/25-0. Portanto, em razão da classificação do plano, o reajuste das mensalidades não está submetido ao percentual máximo de reajuste que é definido anualmente pela ANS, o qual se aplica apenas planos individuais ou familiares contratados após 1º de janeiro de 1999 ou adaptados à Lei n</w:t>
+                                                              <w:t>O Plano CASSI Família Integral, plano coletivo sem patrocinador, está registrado na ANS sob o n° 505.027/25-8. Portanto, em razão da classificação do plano, o reajuste das mensalidades não está submetido ao percentual máximo de reajuste que é definido anualmente pela ANS, o qual se aplica apenas planos individuais ou familiares contratados após 1º de janeiro de 1999 ou adaptados à Lei n</w:t>
                                                             </w:r>
                                                             <w:r>
                                                               <w:rPr>
@@ -949,7 +804,7 @@
                                                             </w:r>
                                                             <w:r>
                                                               <w:br/>
-                                                              <w:t>O percentual de o reajuste é calculado pela CASSI de forma bastante criteriosa, levando-se em consideração fatores como a inflação nos serviços/procedimentos de saúde cobertos pelo plano e o aumento no nível de utilização dos serviços (a chamada ‘sinistralidade’), sempre com o cuidado de não onerar excessivamente os participantes.</w:t>
+                                                              <w:t>O percentual de reajuste é calculado pela CASSI de forma bastante criteriosa, levando-se em consideração fatores como a inflação nos serviços/procedimentos de saúde cobertos pelo plano e o aumento no nível de utilização dos serviços (a chamada ‘sinistralidade’), sempre com o cuidado de não onerar excessivamente os participantes.</w:t>
                                                             </w:r>
                                                             <w:r>
                                                               <w:br/>
@@ -1097,10 +952,10 @@
                                                           <w:p>
                                                             <w:r>
                                                               <w:drawing>
-                                                                <wp:inline distT="0" distB="0" distL="0" distR="0" wp14:anchorId="09EEC04E" wp14:editId="0AFEB0DE">
+                                                                <wp:inline distT="0" distB="0" distL="0" distR="0" wp14:anchorId="3170CB8A" wp14:editId="12DDE7EB">
                                                                   <wp:extent cx="5400040" cy="944880"/>
                                                                   <wp:effectExtent l="0" t="0" r="0" b="0"/>
-                                                                  <wp:docPr id="1178282880" name="Imagem 4"/>
+                                                                  <wp:docPr id="384721489" name="Imagem 4"/>
                                                                   <wp:cNvGraphicFramePr>
                                                                     <a:graphicFrameLocks xmlns:a="http://schemas.openxmlformats.org/drawingml/2006/main" noChangeAspect="1"/>
                                                                   </wp:cNvGraphicFramePr>
@@ -1634,7 +1489,6 @@
     <w:name w:val="Normal (Web)"/>
     <w:basedOn w:val="Normal"/>
     <w:uiPriority w:val="99"/>
-    <w:semiHidden/>
     <w:unhideWhenUsed/>
     <w:rsid w:val="00E11725"/>
     <w:pPr>
@@ -1671,6 +1525,11 @@
       <w:color w:val="605E5C"/>
       <w:shd w:val="clear" w:color="auto" w:fill="E1DFDD"/>
     </w:rPr>
+  </w:style>
+  <w:style w:type="character" w:customStyle="1" w:styleId="docx-char-spacing">
+    <w:name w:val="docx-char-spacing"/>
+    <w:basedOn w:val="Fontepargpadro"/>
+    <w:rsid w:val="00581158"/>
   </w:style>
 </w:styles>
 </file>
@@ -1971,17 +1830,12 @@
 </file>
 
 <file path=customXml/item1.xml><?xml version="1.0" encoding="utf-8"?>
-<p:properties xmlns:p="http://schemas.microsoft.com/office/2006/metadata/properties" xmlns:xsi="http://www.w3.org/2001/XMLSchema-instance" xmlns:pc="http://schemas.microsoft.com/office/infopath/2007/PartnerControls">
-  <documentManagement>
-    <_ip_UnifiedCompliancePolicyUIAction xmlns="http://schemas.microsoft.com/sharepoint/v3" xsi:nil="true"/>
-    <_ip_UnifiedCompliancePolicyProperties xmlns="http://schemas.microsoft.com/sharepoint/v3" xsi:nil="true"/>
-    <lcf76f155ced4ddcb4097134ff3c332f xmlns="42c41a5d-079c-4261-8081-3397dce53b61">
-      <Terms xmlns="http://schemas.microsoft.com/office/infopath/2007/PartnerControls"/>
-    </lcf76f155ced4ddcb4097134ff3c332f>
-    <TaxCatchAll xmlns="1ed76d47-74f8-4445-9dc3-f241e70feb53" xsi:nil="true"/>
-    <_Flow_SignoffStatus xmlns="42c41a5d-079c-4261-8081-3397dce53b61" xsi:nil="true"/>
-  </documentManagement>
-</p:properties>
+<?mso-contentType ?>
+<FormTemplates xmlns="http://schemas.microsoft.com/sharepoint/v3/contenttype/forms">
+  <Display>DocumentLibraryForm</Display>
+  <Edit>DocumentLibraryForm</Edit>
+  <New>DocumentLibraryForm</New>
+</FormTemplates>
 </file>
 
 <file path=customXml/item2.xml><?xml version="1.0" encoding="utf-8"?>
@@ -2261,22 +2115,23 @@
 </file>
 
 <file path=customXml/item3.xml><?xml version="1.0" encoding="utf-8"?>
-<?mso-contentType ?>
-<FormTemplates xmlns="http://schemas.microsoft.com/sharepoint/v3/contenttype/forms">
-  <Display>DocumentLibraryForm</Display>
-  <Edit>DocumentLibraryForm</Edit>
-  <New>DocumentLibraryForm</New>
-</FormTemplates>
+<p:properties xmlns:p="http://schemas.microsoft.com/office/2006/metadata/properties" xmlns:xsi="http://www.w3.org/2001/XMLSchema-instance" xmlns:pc="http://schemas.microsoft.com/office/infopath/2007/PartnerControls">
+  <documentManagement>
+    <_ip_UnifiedCompliancePolicyUIAction xmlns="http://schemas.microsoft.com/sharepoint/v3" xsi:nil="true"/>
+    <_ip_UnifiedCompliancePolicyProperties xmlns="http://schemas.microsoft.com/sharepoint/v3" xsi:nil="true"/>
+    <lcf76f155ced4ddcb4097134ff3c332f xmlns="42c41a5d-079c-4261-8081-3397dce53b61">
+      <Terms xmlns="http://schemas.microsoft.com/office/infopath/2007/PartnerControls"/>
+    </lcf76f155ced4ddcb4097134ff3c332f>
+    <TaxCatchAll xmlns="1ed76d47-74f8-4445-9dc3-f241e70feb53" xsi:nil="true"/>
+    <_Flow_SignoffStatus xmlns="42c41a5d-079c-4261-8081-3397dce53b61" xsi:nil="true"/>
+  </documentManagement>
+</p:properties>
 </file>
 
 <file path=customXml/itemProps1.xml><?xml version="1.0" encoding="utf-8"?>
-<ds:datastoreItem xmlns:ds="http://schemas.openxmlformats.org/officeDocument/2006/customXml" ds:itemID="{DBBDCA0C-EB10-4808-AC1E-3124AF8AA61A}">
+<ds:datastoreItem xmlns:ds="http://schemas.openxmlformats.org/officeDocument/2006/customXml" ds:itemID="{3520FDDE-9A88-41B5-9141-358D93927751}">
   <ds:schemaRefs>
-    <ds:schemaRef ds:uri="http://schemas.microsoft.com/office/2006/metadata/properties"/>
-    <ds:schemaRef ds:uri="http://schemas.microsoft.com/office/infopath/2007/PartnerControls"/>
-    <ds:schemaRef ds:uri="http://schemas.microsoft.com/sharepoint/v3"/>
-    <ds:schemaRef ds:uri="42c41a5d-079c-4261-8081-3397dce53b61"/>
-    <ds:schemaRef ds:uri="1ed76d47-74f8-4445-9dc3-f241e70feb53"/>
+    <ds:schemaRef ds:uri="http://schemas.microsoft.com/sharepoint/v3/contenttype/forms"/>
   </ds:schemaRefs>
 </ds:datastoreItem>
 </file>
@@ -2302,9 +2157,13 @@
 </file>
 
 <file path=customXml/itemProps3.xml><?xml version="1.0" encoding="utf-8"?>
-<ds:datastoreItem xmlns:ds="http://schemas.openxmlformats.org/officeDocument/2006/customXml" ds:itemID="{3520FDDE-9A88-41B5-9141-358D93927751}">
+<ds:datastoreItem xmlns:ds="http://schemas.openxmlformats.org/officeDocument/2006/customXml" ds:itemID="{DBBDCA0C-EB10-4808-AC1E-3124AF8AA61A}">
   <ds:schemaRefs>
-    <ds:schemaRef ds:uri="http://schemas.microsoft.com/sharepoint/v3/contenttype/forms"/>
+    <ds:schemaRef ds:uri="http://schemas.microsoft.com/office/2006/metadata/properties"/>
+    <ds:schemaRef ds:uri="http://schemas.microsoft.com/office/infopath/2007/PartnerControls"/>
+    <ds:schemaRef ds:uri="http://schemas.microsoft.com/sharepoint/v3"/>
+    <ds:schemaRef ds:uri="42c41a5d-079c-4261-8081-3397dce53b61"/>
+    <ds:schemaRef ds:uri="1ed76d47-74f8-4445-9dc3-f241e70feb53"/>
   </ds:schemaRefs>
 </ds:datastoreItem>
 </file>
</xml_diff>

<commit_message>
Corrige faixa preta e transbordo do banner nos modelos 2026
Os modelos vieram de conversao HTML->DOCX, que deixou dois defeitos:

- borda superior com w:color=auto e sz=36 (4,5pt) na tabela do cabecalho,
  que o Word renderiza como uma faixa preta acima do banner
- w:tblW inflado em +496 twips (24,8pt) acima do w:tblGrid em tres niveis
  aninhados, fazendo a tabela do banner transbordar a direita como uma aba

Adiciona corrigir_modelo.py, que detecta e corrige os dois casos, para
reaproveitar quando novos modelos vierem da mesma conversao.
</commit_message>
<xml_diff>
--- a/modelos/2026/integral.docx
+++ b/modelos/2026/integral.docx
@@ -79,7 +79,7 @@
           </w:tcPr>
           <w:tbl>
             <w:tblPr>
-              <w:tblW w:w="9000" w:type="dxa"/>
+              <w:tblW w:w="8504" w:type="dxa"/>
               <w:jc w:val="center"/>
               <w:tblCellMar>
                 <w:left w:w="0" w:type="dxa"/>
@@ -179,7 +179,7 @@
                                         </w:tcPr>
                                         <w:tbl>
                                           <w:tblPr>
-                                            <w:tblW w:w="9000" w:type="dxa"/>
+                                            <w:tblW w:w="8504" w:type="dxa"/>
                                             <w:tblCellMar>
                                               <w:left w:w="0" w:type="dxa"/>
                                               <w:right w:w="0" w:type="dxa"/>
@@ -224,7 +224,7 @@
                                                       <w:tblPr>
                                                         <w:tblW w:w="5000" w:type="pct"/>
                                                         <w:tblBorders>
-                                                          <w:top w:val="single" w:sz="36" w:space="0" w:color="auto"/>
+                                                          <w:top w:val="nil"/>
                                                         </w:tblBorders>
                                                         <w:shd w:val="clear" w:color="auto" w:fill="2F54CF"/>
                                                         <w:tblCellMar>
@@ -252,7 +252,7 @@
                                                           </w:tcPr>
                                                           <w:tbl>
                                                             <w:tblPr>
-                                                              <w:tblW w:w="8100" w:type="dxa"/>
+                                                              <w:tblW w:w="7604" w:type="dxa"/>
                                                               <w:tblCellMar>
                                                                 <w:left w:w="0" w:type="dxa"/>
                                                                 <w:right w:w="0" w:type="dxa"/>
@@ -271,7 +271,7 @@
                                                                 </w:tcPr>
                                                                 <w:tbl>
                                                                   <w:tblPr>
-                                                                    <w:tblW w:w="8100" w:type="dxa"/>
+                                                                    <w:tblW w:w="7604" w:type="dxa"/>
                                                                     <w:tblCellMar>
                                                                       <w:left w:w="0" w:type="dxa"/>
                                                                       <w:right w:w="0" w:type="dxa"/>
@@ -279,13 +279,13 @@
                                                                     <w:tblLook w:val="04A0" w:firstRow="1" w:lastRow="0" w:firstColumn="1" w:lastColumn="0" w:noHBand="0" w:noVBand="1"/>
                                                                   </w:tblPr>
                                                                   <w:tblGrid>
-                                                                    <w:gridCol w:w="4050"/>
-                                                                    <w:gridCol w:w="4050"/>
+                                                                    <w:gridCol w:w="3802"/>
+                                                                    <w:gridCol w:w="3802"/>
                                                                   </w:tblGrid>
                                                                   <w:tr>
                                                                     <w:tc>
                                                                       <w:tcPr>
-                                                                        <w:tcW w:w="4005" w:type="dxa"/>
+                                                                        <w:tcW w:w="3760" w:type="dxa"/>
                                                                         <w:tcMar>
                                                                           <w:top w:w="0" w:type="dxa"/>
                                                                           <w:left w:w="0" w:type="dxa"/>
@@ -397,7 +397,7 @@
                                                                     </w:tc>
                                                                     <w:tc>
                                                                       <w:tcPr>
-                                                                        <w:tcW w:w="4005" w:type="dxa"/>
+                                                                        <w:tcW w:w="3760" w:type="dxa"/>
                                                                         <w:tcMar>
                                                                           <w:top w:w="0" w:type="dxa"/>
                                                                           <w:left w:w="45" w:type="dxa"/>

</xml_diff>